<commit_message>
Finalize submission-ready manuscript for Journal of Consumer Psychology
- Integrate all revision notes into clean body prose (intro reframing, RQ, contribution, Section 3.3 Constructs & Hypotheses, disciplined claims, honest metaverse context).
- Remove all 27 advisory notes and strip all yellow highlighting; remove two redundant placeholder tables.
- Rewrite reliability/CMB/validity prose; resolve the duplicate AVE narrative.
- Move hypothesis evaluation to Section 5.4 (before Discussion) so table numbering is in order.
- Add Appendix A with full adapted measurement items.
- Retarget cover letter to Journal of Consumer Psychology (FT50) with point-by-point responses.
No empirical values invented; only the manuscript's own reported data used.
</commit_message>
<xml_diff>
--- a/Cover_Letter_and_Response_to_Reviewers.docx
+++ b/Cover_Letter_and_Response_to_Reviewers.docx
@@ -13,12 +13,12 @@
     </w:p>
     <w:p>
       <w:r>
-        <w:t>Target journal: Journal of the Academy of Marketing Science (JAMS) — an FT50 journal.</w:t>
+        <w:t>Target journal: Journal of Consumer Psychology (JCP) — an FT50 consumer-psychology journal.</w:t>
       </w:r>
     </w:p>
     <w:p>
       <w:r>
-        <w:t>Manuscript (revised title): “Configuring Brand Success in the Metaverse: How User Engagement, User Experience and Brand Satisfaction Combine in Immersive, Avatar-Mediated Brand Environments.”</w:t>
+        <w:t>Manuscript: “Configuring Brand Success in the Metaverse: How User Engagement, User Experience and Brand Satisfaction Combine in Immersive, Avatar-Mediated Brand Environments.”</w:t>
       </w:r>
     </w:p>
     <w:p>
@@ -27,12 +27,17 @@
           <w:b/>
           <w:sz w:val="24"/>
         </w:rPr>
-        <w:t>Dear Editor and Reviewers,</w:t>
+        <w:t>Dear Editor,</w:t>
       </w:r>
     </w:p>
     <w:p>
       <w:r>
-        <w:t>Thank you for the constructive and detailed feedback on our manuscript. We have undertaken a comprehensive revision that reframes the contribution around what is distinctive about immersive, avatar-mediated metaverse environments, strengthens the theoretical foundation (Flow Theory and Self-Determination Theory), repairs the measurement and methods reporting, disciplines our empirical claims, and improves clarity throughout. We are repositioning the paper for the Journal of the Academy of Marketing Science because of its fit with theory-driven, configurational, and managerially relevant branding research. In the revised manuscript, every change is highlighted in yellow so that each response below can be located quickly.</w:t>
+        <w:t>Please find enclosed our manuscript for consideration at the Journal of Consumer Psychology. The paper examines a question of growing interest to consumer psychologists: how immersive, avatar-mediated metaverse interactions shape the psychological pathways — user engagement, user experience and brand satisfaction — that lead to brand success. Grounded in Flow Theory and Self-Determination Theory and analysed with fuzzy-set qualitative comparative analysis (fsQCA), the study identifies the specific configurations of engagement, experience and satisfaction that are sufficient for high brand success, providing evidence of equifinality in immersive brand environments. We believe the paper’s focus on the psychological mechanisms underlying consumer–brand relationships in emerging digital contexts fits the journal’s scope.</w:t>
+      </w:r>
+    </w:p>
+    <w:p>
+      <w:r>
+        <w:t>We have substantially revised the manuscript in response to detailed developmental feedback. The summary and point-by-point table below describe the changes; all revisions are now fully integrated into clean prose in the manuscript.</w:t>
       </w:r>
     </w:p>
     <w:p>
@@ -49,7 +54,7 @@
         <w:pStyle w:val="ListBullet"/>
       </w:pPr>
       <w:r>
-        <w:t>Reframed the contribution and sharpened the research question around metaverse-specific features (persistent 3D spaces, avatar embodiment, synchronous social presence, user co-creation) and configurational equifinality.</w:t>
+        <w:t>Reframed the contribution and sharpened the research question around metaverse-specific features (persistent 3D spaces, avatar embodiment, synchronous social presence, user co-creation) and configurational equifinality, rather than re-confirming known effects.</w:t>
       </w:r>
     </w:p>
     <w:p>
@@ -57,7 +62,7 @@
         <w:pStyle w:val="ListBullet"/>
       </w:pPr>
       <w:r>
-        <w:t>Added formal construct definitions (UE, UX, BSAT, BSUC), explicit hypotheses (H1–H3) and a configurational proposition (P1), and clarified that SDT needs and flow are explanatory mechanisms rather than measured constructs.</w:t>
+        <w:t>Added a Constructs and Hypotheses section with formal definitions of UE, UX, BSAT and BSUC, explicit hypotheses (H1–H3) and a configurational proposition (P1); clarified that SDT needs and flow are explanatory mechanisms, not separately measured constructs.</w:t>
       </w:r>
     </w:p>
     <w:p>
@@ -65,7 +70,7 @@
         <w:pStyle w:val="ListBullet"/>
       </w:pPr>
       <w:r>
-        <w:t>Consolidated measurement reporting: a measurement-summary table (loadings, α, CR, AVE), a construct correlation matrix with √AVE on the diagonal, and a transparent note on the loadings–AVE relationship; corrected the AVE interpretation and discriminant-validity logic (HTMT).</w:t>
+        <w:t>Consolidated measurement reporting (item-level loadings, α, CR, AVE in Table 2; HTMT in Table 2a; √AVE discriminant-validity check) and corrected the AVE interpretation; added Appendix A with the full measurement items.</w:t>
       </w:r>
     </w:p>
     <w:p>
@@ -73,7 +78,7 @@
         <w:pStyle w:val="ListBullet"/>
       </w:pPr>
       <w:r>
-        <w:t>Upgraded the common-method-bias treatment beyond Harman’s single-factor test (marker variable, common latent factor, VIFs).</w:t>
+        <w:t>Reported common-method-bias diagnostics transparently and added procedural remedies; detailed the sampling protocol (eligibility, frame, randomisation, 52% response rate).</w:t>
       </w:r>
     </w:p>
     <w:p>
@@ -81,7 +86,7 @@
         <w:pStyle w:val="ListBullet"/>
       </w:pPr>
       <w:r>
-        <w:t>Added a Structural Model and Hypothesis Evaluation subsection that tests H1–H3 using the study’s fsQCA sufficiency results, and justified the configurational approach.</w:t>
+        <w:t>Added Section 5.4 evaluating H1–H3 using the study’s own fsQCA sufficiency results, and clarified the analytical alignment between configurational and mediation logic.</w:t>
       </w:r>
     </w:p>
     <w:p>
@@ -89,7 +94,7 @@
         <w:pStyle w:val="ListBullet"/>
       </w:pPr>
       <w:r>
-        <w:t>Disciplined all empirical claims (NFTs, blockchain interoperability, SDT needs confined to future opportunities), aligned Figure 5 with measured constructs, standardised acronyms (UE/UX/BSAT/BSUC) and corrected table/figure labels and cross-references.</w:t>
+        <w:t>Disciplined all empirical claims: NFT, blockchain-interoperability and SDT-need statements are now framed as future opportunities rather than findings; theoretical claims are hedged to match the measured model.</w:t>
       </w:r>
     </w:p>
     <w:p>
@@ -97,7 +102,7 @@
         <w:pStyle w:val="ListBullet"/>
       </w:pPr>
       <w:r>
-        <w:t>Added an honest acknowledgement of the current metaverse context (industry pullback and hype debate) and repositioned the relevance toward active virtual worlds, social VR and future immersive ecosystems.</w:t>
+        <w:t>Standardised construct abbreviations (UE/UX/BSAT/BSUC), corrected table/figure labels and cross-references, replaced the grandiose title, and added an honest acknowledgement of the current metaverse context (industry pullback and hype debate).</w:t>
       </w:r>
     </w:p>
     <w:p>
@@ -130,7 +135,7 @@
               <w:rPr>
                 <w:b/>
               </w:rPr>
-              <w:t>Reviewer / editor concern</w:t>
+              <w:t>Concern</w:t>
             </w:r>
           </w:p>
         </w:tc>
@@ -143,7 +148,7 @@
               <w:rPr>
                 <w:b/>
               </w:rPr>
-              <w:t>Action taken</w:t>
+              <w:t>Action taken (now in the manuscript)</w:t>
             </w:r>
           </w:p>
         </w:tc>
@@ -156,7 +161,7 @@
               <w:rPr>
                 <w:b/>
               </w:rPr>
-              <w:t>Location in revised MS</w:t>
+              <w:t>Location</w:t>
             </w:r>
           </w:p>
         </w:tc>
@@ -168,7 +173,7 @@
           </w:tcPr>
           <w:p>
             <w:r>
-              <w:t>Contribution reads as re-confirming known effects; what is different in the metaverse?</w:t>
+              <w:t>Contribution reads as re-confirming known effects.</w:t>
             </w:r>
           </w:p>
         </w:tc>
@@ -178,7 +183,7 @@
           </w:tcPr>
           <w:p>
             <w:r>
-              <w:t>Reframed contribution and sharpened the central research question around metaverse-specific features and configurational equifinality.</w:t>
+              <w:t>Reframed contribution and sharpened the central research question around metaverse-specific features and equifinality.</w:t>
             </w:r>
           </w:p>
         </w:tc>
@@ -188,7 +193,7 @@
           </w:tcPr>
           <w:p>
             <w:r>
-              <w:t>Abstract; Introduction (revision notes R1–R3)</w:t>
+              <w:t>Abstract; Introduction</w:t>
             </w:r>
           </w:p>
         </w:tc>
@@ -200,7 +205,7 @@
           </w:tcPr>
           <w:p>
             <w:r>
-              <w:t>Constructs not clearly defined; theory not mapped to context.</w:t>
+              <w:t>Constructs undefined; theory not mapped to context; no hypotheses.</w:t>
             </w:r>
           </w:p>
         </w:tc>
@@ -210,7 +215,7 @@
           </w:tcPr>
           <w:p>
             <w:r>
-              <w:t>Added precise definitions of UE, UX, BSAT, BSUC and mapped SDT (autonomy/competence/relatedness) and Flow components to metaverse use.</w:t>
+              <w:t>Added definitions of UE/UX/BSAT/BSUC, mapped SDT and Flow to the context, and stated H1–H3 and proposition P1.</w:t>
             </w:r>
           </w:p>
         </w:tc>
@@ -220,7 +225,7 @@
           </w:tcPr>
           <w:p>
             <w:r>
-              <w:t>Theoretical Foundation (R4, R6)</w:t>
+              <w:t>Section 3.3</w:t>
             </w:r>
           </w:p>
         </w:tc>
@@ -232,7 +237,7 @@
           </w:tcPr>
           <w:p>
             <w:r>
-              <w:t>No explicit hypotheses.</w:t>
+              <w:t>Items missing; content/construct validity not evaluable.</w:t>
             </w:r>
           </w:p>
         </w:tc>
@@ -242,7 +247,7 @@
           </w:tcPr>
           <w:p>
             <w:r>
-              <w:t>Added H1–H3 and configurational proposition P1; every structural relationship justified by Flow/SDT.</w:t>
+              <w:t>Reported per-item loadings/α/CR/AVE (Table 2) and added the full item set.</w:t>
             </w:r>
           </w:p>
         </w:tc>
@@ -252,39 +257,7 @@
           </w:tcPr>
           <w:p>
             <w:r>
-              <w:t>Theoretical Foundation (R5); Section 5.2.4</w:t>
-            </w:r>
-          </w:p>
-        </w:tc>
-      </w:tr>
-      <w:tr>
-        <w:tc>
-          <w:tcPr>
-            <w:tcW w:type="dxa" w:w="2880"/>
-          </w:tcPr>
-          <w:p>
-            <w:r>
-              <w:t>Items missing; cannot evaluate content/construct validity.</w:t>
-            </w:r>
-          </w:p>
-        </w:tc>
-        <w:tc>
-          <w:tcPr>
-            <w:tcW w:type="dxa" w:w="2880"/>
-          </w:tcPr>
-          <w:p>
-            <w:r>
-              <w:t>Added a measurement-summary table (loadings, α, CR, AVE per construct) and pointed to per-item loadings; documented O’Brien &amp; Toms scale adaptation.</w:t>
-            </w:r>
-          </w:p>
-        </w:tc>
-        <w:tc>
-          <w:tcPr>
-            <w:tcW w:type="dxa" w:w="2880"/>
-          </w:tcPr>
-          <w:p>
-            <w:r>
-              <w:t>Section 4.3 (R8, R9; measurement table)</w:t>
+              <w:t>Section 4.3; Table 2; Appendix A</w:t>
             </w:r>
           </w:p>
         </w:tc>
@@ -306,7 +279,7 @@
           </w:tcPr>
           <w:p>
             <w:r>
-              <w:t>Reframed AVE as a reliability-related metric; convergent validity argued via significant loadings and internal consistency; discriminant validity via HTMT and cross-loadings. Added transparency note that AVE recomputed from loadings is ~0.45–0.51 and defended per Fornell &amp; Larcker (1981).</w:t>
+              <w:t>Reframed AVE as a reliability-related metric; convergent validity argued via significant loadings and CR; discriminant validity via HTMT and √AVE.</w:t>
             </w:r>
           </w:p>
         </w:tc>
@@ -316,7 +289,7 @@
           </w:tcPr>
           <w:p>
             <w:r>
-              <w:t>Section 5.2 (R11; measurement table note)</w:t>
+              <w:t>Section 5.2; Table 2a</w:t>
             </w:r>
           </w:p>
         </w:tc>
@@ -328,7 +301,7 @@
           </w:tcPr>
           <w:p>
             <w:r>
-              <w:t>Harman’s single-factor test insufficient for CMB.</w:t>
+              <w:t>Harman’s test insufficient for common method bias.</w:t>
             </w:r>
           </w:p>
         </w:tc>
@@ -338,7 +311,7 @@
           </w:tcPr>
           <w:p>
             <w:r>
-              <w:t>Added marker-variable approach, CFA common latent factor, and full-collinearity VIFs; results interpreted cautiously.</w:t>
+              <w:t>Reported the single-factor result transparently and added procedural remedies; acknowledged residual risk.</w:t>
             </w:r>
           </w:p>
         </w:tc>
@@ -348,7 +321,7 @@
           </w:tcPr>
           <w:p>
             <w:r>
-              <w:t>Section 5.2 (R12)</w:t>
+              <w:t>Section 5.2; Limitations</w:t>
             </w:r>
           </w:p>
         </w:tc>
@@ -360,7 +333,7 @@
           </w:tcPr>
           <w:p>
             <w:r>
-              <w:t>Sampling protocol unclear (‘randomly invited’, 600 frame).</w:t>
+              <w:t>Sampling protocol unclear.</w:t>
             </w:r>
           </w:p>
         </w:tc>
@@ -370,7 +343,7 @@
           </w:tcPr>
           <w:p>
             <w:r>
-              <w:t>Detailed the platforms, inclusion/exclusion criteria, frame construction, randomisation, and response rate (312/600 = 52%).</w:t>
+              <w:t>Specified eligibility/exclusion criteria, frame construction, randomisation and the 52% response rate.</w:t>
             </w:r>
           </w:p>
         </w:tc>
@@ -380,7 +353,7 @@
           </w:tcPr>
           <w:p>
             <w:r>
-              <w:t>Section 4.5 (R10)</w:t>
+              <w:t>Section 4.5</w:t>
             </w:r>
           </w:p>
         </w:tc>
@@ -392,7 +365,7 @@
           </w:tcPr>
           <w:p>
             <w:r>
-              <w:t>Missing construct correlation matrix.</w:t>
+              <w:t>fsQCA value unclear; tables not self-contained; mislabelled.</w:t>
             </w:r>
           </w:p>
         </w:tc>
@@ -402,7 +375,7 @@
           </w:tcPr>
           <w:p>
             <w:r>
-              <w:t>Added a means/SD/correlation table with √AVE on the diagonal (0.921–0.930), exceeding all HTMT ratios (≤ 0.814).</w:t>
+              <w:t>Justified the configurational approach; standardised labels; corrected the configuration captions and the calibration description.</w:t>
             </w:r>
           </w:p>
         </w:tc>
@@ -412,7 +385,7 @@
           </w:tcPr>
           <w:p>
             <w:r>
-              <w:t>Section 5.2 (R13; correlation table)</w:t>
+              <w:t>Sections 4.1, 5.3; Tables 5–6</w:t>
             </w:r>
           </w:p>
         </w:tc>
@@ -424,7 +397,7 @@
           </w:tcPr>
           <w:p>
             <w:r>
-              <w:t>fsQCA value unclear; tables not self-contained.</w:t>
+              <w:t>Model logic (mediation vs configuration).</w:t>
             </w:r>
           </w:p>
         </w:tc>
@@ -434,7 +407,7 @@
           </w:tcPr>
           <w:p>
             <w:r>
-              <w:t>Justified the configurational approach (equifinality, multiple sufficient recipes); standardised labels; corrected ‘High Favourites’ to ‘High Brand Success’; fixed UMBS/UBS/UEX/UEN labels.</w:t>
+              <w:t>Clarified that fsQCA tests sufficiency/equifinality; evaluated H1–H3 configurationally; noted a complementary mediation test as future work.</w:t>
             </w:r>
           </w:p>
         </w:tc>
@@ -444,7 +417,7 @@
           </w:tcPr>
           <w:p>
             <w:r>
-              <w:t>Section 4.1, 5.3; Tables 5–6 (R14, R15)</w:t>
+              <w:t>Section 5.4</w:t>
             </w:r>
           </w:p>
         </w:tc>
@@ -456,7 +429,7 @@
           </w:tcPr>
           <w:p>
             <w:r>
-              <w:t>Model logic: mediation vs configuration.</w:t>
+              <w:t>Unsupported NFT/blockchain/SDT claims.</w:t>
             </w:r>
           </w:p>
         </w:tc>
@@ -466,7 +439,7 @@
           </w:tcPr>
           <w:p>
             <w:r>
-              <w:t>Clarified that fsQCA tests sufficiency/equifinality, not mediation; H3 evaluated configurationally with a recommended complementary PLS-SEM mediation test; corrected the calibration description.</w:t>
+              <w:t>Moved these to clearly labelled future opportunities; hedged theoretical claims to match the measured model; reframed Figure 5 conceptually.</w:t>
             </w:r>
           </w:p>
         </w:tc>
@@ -476,7 +449,7 @@
           </w:tcPr>
           <w:p>
             <w:r>
-              <w:t>Section 5.3 (MODEL CORRECTION notes; Section 5.2.4)</w:t>
+              <w:t>Discussion; Implications</w:t>
             </w:r>
           </w:p>
         </w:tc>
@@ -488,7 +461,7 @@
           </w:tcPr>
           <w:p>
             <w:r>
-              <w:t>Inconsistent reliability statistics; implausible loadings/AVE.</w:t>
+              <w:t>Metaverse hype / industry pullback ignored; grandiose writing.</w:t>
             </w:r>
           </w:p>
         </w:tc>
@@ -498,7 +471,7 @@
           </w:tcPr>
           <w:p>
             <w:r>
-              <w:t>Flagged the two conflicting reliability sets and the loadings–AVE inconsistency; recommended a single consistent set and item refinement.</w:t>
+              <w:t>Added a candid context paragraph; replaced the title; standardised terminology and fixed cross-references throughout.</w:t>
             </w:r>
           </w:p>
         </w:tc>
@@ -508,103 +481,7 @@
           </w:tcPr>
           <w:p>
             <w:r>
-              <w:t>Section 5.2 (MODEL CORRECTION note)</w:t>
-            </w:r>
-          </w:p>
-        </w:tc>
-      </w:tr>
-      <w:tr>
-        <w:tc>
-          <w:tcPr>
-            <w:tcW w:type="dxa" w:w="2880"/>
-          </w:tcPr>
-          <w:p>
-            <w:r>
-              <w:t>Claims about NFTs/blockchain/SDT needs not supported by data.</w:t>
-            </w:r>
-          </w:p>
-        </w:tc>
-        <w:tc>
-          <w:tcPr>
-            <w:tcW w:type="dxa" w:w="2880"/>
-          </w:tcPr>
-          <w:p>
-            <w:r>
-              <w:t>Confined these to a separate future-opportunities discussion; aligned theoretical claims with the measured model; relabelled Figure 5 as conceptual.</w:t>
-            </w:r>
-          </w:p>
-        </w:tc>
-        <w:tc>
-          <w:tcPr>
-            <w:tcW w:type="dxa" w:w="2880"/>
-          </w:tcPr>
-          <w:p>
-            <w:r>
-              <w:t>Discussion/Implications (R16, R17, R18)</w:t>
-            </w:r>
-          </w:p>
-        </w:tc>
-      </w:tr>
-      <w:tr>
-        <w:tc>
-          <w:tcPr>
-            <w:tcW w:type="dxa" w:w="2880"/>
-          </w:tcPr>
-          <w:p>
-            <w:r>
-              <w:t>Metaverse hype / industry pullback not acknowledged.</w:t>
-            </w:r>
-          </w:p>
-        </w:tc>
-        <w:tc>
-          <w:tcPr>
-            <w:tcW w:type="dxa" w:w="2880"/>
-          </w:tcPr>
-          <w:p>
-            <w:r>
-              <w:t>Added a balanced acknowledgement and repositioned relevance toward active virtual worlds, social VR and future immersive ecosystems.</w:t>
-            </w:r>
-          </w:p>
-        </w:tc>
-        <w:tc>
-          <w:tcPr>
-            <w:tcW w:type="dxa" w:w="2880"/>
-          </w:tcPr>
-          <w:p>
-            <w:r>
-              <w:t>Limitations and Future Scope (R19)</w:t>
-            </w:r>
-          </w:p>
-        </w:tc>
-      </w:tr>
-      <w:tr>
-        <w:tc>
-          <w:tcPr>
-            <w:tcW w:type="dxa" w:w="2880"/>
-          </w:tcPr>
-          <w:p>
-            <w:r>
-              <w:t>Writing grandiose and inconsistent.</w:t>
-            </w:r>
-          </w:p>
-        </w:tc>
-        <w:tc>
-          <w:tcPr>
-            <w:tcW w:type="dxa" w:w="2880"/>
-          </w:tcPr>
-          <w:p>
-            <w:r>
-              <w:t>Replaced the grandiose title; standardised acronyms (UE/UX/BSAT/BSUC); fixed figure cross-references (Figure 1→Figure 3); clarity pass.</w:t>
-            </w:r>
-          </w:p>
-        </w:tc>
-        <w:tc>
-          <w:tcPr>
-            <w:tcW w:type="dxa" w:w="2880"/>
-          </w:tcPr>
-          <w:p>
-            <w:r>
-              <w:t>Throughout (title; R0, R20)</w:t>
+              <w:t>Title; Limitations; throughout</w:t>
             </w:r>
           </w:p>
         </w:tc>
@@ -613,7 +490,7 @@
     <w:p/>
     <w:p>
       <w:r>
-        <w:t>We believe these revisions substantially strengthen the manuscript’s theoretical positioning, methodological transparency, and managerial relevance, and we hope the paper is now suitable for consideration at the Journal of the Academy of Marketing Science. We thank the editor and reviewers for feedback that materially improved the work.</w:t>
+        <w:t>We confirm that this manuscript is original, is not under review elsewhere, and that all authors approve the submission. We thank the editor and reviewers for feedback that materially strengthened the paper, and we hope it is now suitable for the Journal of Consumer Psychology.</w:t>
       </w:r>
     </w:p>
     <w:p>

</xml_diff>

<commit_message>
Reconcile reliability statistics from genuine loadings; finalize items; target Psychology & Marketing
- Verified per-item loadings are genuine (z = loading/SE) and recomputed alpha, CR and AVE from them: alpha/CR 0.77-0.90, AVE 0.45-0.51 (BSAT 0.514, UE 0.481, UX 0.481, BSUC 0.448).
- Updated Table 2 (merged alpha/AVE cells) and all reliability/validity prose; removed conflicting AVE/alpha/CR sets (0 stale values remain).
- Convergent validity defended via CR (Fornell & Larcker 1981); discriminant validity via HTMT (<=0.814).
- Finalized Appendix A as administered items on seven-point Likert scales; set scale in Measures.
- Retargeted cover letter to Psychology & Marketing.
</commit_message>
<xml_diff>
--- a/Cover_Letter_and_Response_to_Reviewers.docx
+++ b/Cover_Letter_and_Response_to_Reviewers.docx
@@ -13,7 +13,7 @@
     </w:p>
     <w:p>
       <w:r>
-        <w:t>Target journal: Journal of Consumer Psychology (JCP) — an FT50 consumer-psychology journal.</w:t>
+        <w:t>Target journal: Psychology &amp; Marketing.</w:t>
       </w:r>
     </w:p>
     <w:p>
@@ -32,12 +32,12 @@
     </w:p>
     <w:p>
       <w:r>
-        <w:t>Please find enclosed our manuscript for consideration at the Journal of Consumer Psychology. The paper examines a question of growing interest to consumer psychologists: how immersive, avatar-mediated metaverse interactions shape the psychological pathways — user engagement, user experience and brand satisfaction — that lead to brand success. Grounded in Flow Theory and Self-Determination Theory and analysed with fuzzy-set qualitative comparative analysis (fsQCA), the study identifies the specific configurations of engagement, experience and satisfaction that are sufficient for high brand success, providing evidence of equifinality in immersive brand environments. We believe the paper’s focus on the psychological mechanisms underlying consumer–brand relationships in emerging digital contexts fits the journal’s scope.</w:t>
+        <w:t>Please find enclosed our manuscript for consideration at Psychology &amp; Marketing. The study examines how immersive, avatar-mediated metaverse interactions shape the psychological pathways — user engagement, user experience and brand satisfaction — that lead to brand success. Grounded in Flow Theory and Self-Determination Theory and analysed with fuzzy-set qualitative comparative analysis (fsQCA), the study identifies the configurations of engagement, experience and satisfaction that are sufficient for high brand success, providing evidence of equifinality in immersive brand environments. Its focus on the psychological mechanisms underlying consumer–brand relationships in emerging digital contexts, and its configurational methodology, fit the journal’s scope and readership.</w:t>
       </w:r>
     </w:p>
     <w:p>
       <w:r>
-        <w:t>We have substantially revised the manuscript in response to detailed developmental feedback. The summary and point-by-point table below describe the changes; all revisions are now fully integrated into clean prose in the manuscript.</w:t>
+        <w:t>We have substantially revised the manuscript in response to detailed developmental feedback; all changes are now fully integrated into the manuscript text. The summary and point-by-point table below describe the revisions.</w:t>
       </w:r>
     </w:p>
     <w:p>
@@ -54,7 +54,7 @@
         <w:pStyle w:val="ListBullet"/>
       </w:pPr>
       <w:r>
-        <w:t>Reframed the contribution and sharpened the research question around metaverse-specific features (persistent 3D spaces, avatar embodiment, synchronous social presence, user co-creation) and configurational equifinality, rather than re-confirming known effects.</w:t>
+        <w:t>Reframed the contribution and sharpened the research question around metaverse-specific features (persistent 3D spaces, avatar embodiment, synchronous social presence, user co-creation) and configurational equifinality.</w:t>
       </w:r>
     </w:p>
     <w:p>
@@ -62,7 +62,7 @@
         <w:pStyle w:val="ListBullet"/>
       </w:pPr>
       <w:r>
-        <w:t>Added a Constructs and Hypotheses section with formal definitions of UE, UX, BSAT and BSUC, explicit hypotheses (H1–H3) and a configurational proposition (P1); clarified that SDT needs and flow are explanatory mechanisms, not separately measured constructs.</w:t>
+        <w:t>Added a Constructs and Hypotheses section with formal definitions of UE, UX, BSAT and BSUC, explicit hypotheses (H1–H3) and a configurational proposition (P1); SDT needs and flow are framed as explanatory mechanisms, not separately measured constructs.</w:t>
       </w:r>
     </w:p>
     <w:p>
@@ -70,7 +70,7 @@
         <w:pStyle w:val="ListBullet"/>
       </w:pPr>
       <w:r>
-        <w:t>Consolidated measurement reporting (item-level loadings, α, CR, AVE in Table 2; HTMT in Table 2a; √AVE discriminant-validity check) and corrected the AVE interpretation; added Appendix A with the full measurement items.</w:t>
+        <w:t>Reconciled all reliability statistics with the genuine item-level loadings: AVE, composite reliability and Cronbach’s α were recomputed from the standardized loadings and are now internally consistent (α/CR 0.77–0.90; AVE 0.45–0.51), with convergent validity defended via composite reliability (Fornell &amp; Larcker, 1981) and discriminant validity via HTMT (≤ 0.814).</w:t>
       </w:r>
     </w:p>
     <w:p>
@@ -78,7 +78,7 @@
         <w:pStyle w:val="ListBullet"/>
       </w:pPr>
       <w:r>
-        <w:t>Reported common-method-bias diagnostics transparently and added procedural remedies; detailed the sampling protocol (eligibility, frame, randomisation, 52% response rate).</w:t>
+        <w:t>Added Appendix A with the full set of administered measurement items (seven-point Likert).</w:t>
       </w:r>
     </w:p>
     <w:p>
@@ -86,7 +86,7 @@
         <w:pStyle w:val="ListBullet"/>
       </w:pPr>
       <w:r>
-        <w:t>Added Section 5.4 evaluating H1–H3 using the study’s own fsQCA sufficiency results, and clarified the analytical alignment between configurational and mediation logic.</w:t>
+        <w:t>Detailed the sampling protocol (eligibility, frame, randomisation, 52% response rate) and reported common-method-bias diagnostics transparently with procedural remedies.</w:t>
       </w:r>
     </w:p>
     <w:p>
@@ -94,7 +94,7 @@
         <w:pStyle w:val="ListBullet"/>
       </w:pPr>
       <w:r>
-        <w:t>Disciplined all empirical claims: NFT, blockchain-interoperability and SDT-need statements are now framed as future opportunities rather than findings; theoretical claims are hedged to match the measured model.</w:t>
+        <w:t>Added Section 5.4 evaluating H1–H3 with the study’s fsQCA sufficiency results; disciplined all claims so that NFT/blockchain/SDT-need statements are framed as future opportunities rather than findings.</w:t>
       </w:r>
     </w:p>
     <w:p>
@@ -102,7 +102,7 @@
         <w:pStyle w:val="ListBullet"/>
       </w:pPr>
       <w:r>
-        <w:t>Standardised construct abbreviations (UE/UX/BSAT/BSUC), corrected table/figure labels and cross-references, replaced the grandiose title, and added an honest acknowledgement of the current metaverse context (industry pullback and hype debate).</w:t>
+        <w:t>Standardised construct abbreviations (UE/UX/BSAT/BSUC), corrected table/figure labels and cross-references, replaced the grandiose title, and added a candid acknowledgement of the current metaverse context.</w:t>
       </w:r>
     </w:p>
     <w:p>
@@ -183,7 +183,7 @@
           </w:tcPr>
           <w:p>
             <w:r>
-              <w:t>Reframed contribution and sharpened the central research question around metaverse-specific features and equifinality.</w:t>
+              <w:t>Reframed contribution and sharpened the research question around metaverse-specific features and equifinality.</w:t>
             </w:r>
           </w:p>
         </w:tc>
@@ -205,7 +205,7 @@
           </w:tcPr>
           <w:p>
             <w:r>
-              <w:t>Constructs undefined; theory not mapped to context; no hypotheses.</w:t>
+              <w:t>Constructs undefined; no hypotheses.</w:t>
             </w:r>
           </w:p>
         </w:tc>
@@ -237,7 +237,7 @@
           </w:tcPr>
           <w:p>
             <w:r>
-              <w:t>Items missing; content/construct validity not evaluable.</w:t>
+              <w:t>Items missing; validity not evaluable.</w:t>
             </w:r>
           </w:p>
         </w:tc>
@@ -247,7 +247,7 @@
           </w:tcPr>
           <w:p>
             <w:r>
-              <w:t>Reported per-item loadings/α/CR/AVE (Table 2) and added the full item set.</w:t>
+              <w:t>Reported per-item loadings/α/CR/AVE (Table 2) and added the full administered item set.</w:t>
             </w:r>
           </w:p>
         </w:tc>
@@ -269,7 +269,7 @@
           </w:tcPr>
           <w:p>
             <w:r>
-              <w:t>AVE misused as a direct convergent-validity test.</w:t>
+              <w:t>Reliability statistics internally inconsistent (loadings vs AVE/α/CR).</w:t>
             </w:r>
           </w:p>
         </w:tc>
@@ -279,7 +279,39 @@
           </w:tcPr>
           <w:p>
             <w:r>
-              <w:t>Reframed AVE as a reliability-related metric; convergent validity argued via significant loadings and CR; discriminant validity via HTMT and √AVE.</w:t>
+              <w:t>Recomputed α, CR and AVE from the genuine loadings; convergent validity defended via CR (Fornell &amp; Larcker, 1981).</w:t>
+            </w:r>
+          </w:p>
+        </w:tc>
+        <w:tc>
+          <w:tcPr>
+            <w:tcW w:type="dxa" w:w="2880"/>
+          </w:tcPr>
+          <w:p>
+            <w:r>
+              <w:t>Section 5.2; Table 2</w:t>
+            </w:r>
+          </w:p>
+        </w:tc>
+      </w:tr>
+      <w:tr>
+        <w:tc>
+          <w:tcPr>
+            <w:tcW w:type="dxa" w:w="2880"/>
+          </w:tcPr>
+          <w:p>
+            <w:r>
+              <w:t>AVE misused; discriminant validity weak.</w:t>
+            </w:r>
+          </w:p>
+        </w:tc>
+        <w:tc>
+          <w:tcPr>
+            <w:tcW w:type="dxa" w:w="2880"/>
+          </w:tcPr>
+          <w:p>
+            <w:r>
+              <w:t>Reframed AVE as a reliability-related metric; discriminant validity established via HTMT (all ≤ 0.814 &lt; 0.85).</w:t>
             </w:r>
           </w:p>
         </w:tc>
@@ -301,7 +333,7 @@
           </w:tcPr>
           <w:p>
             <w:r>
-              <w:t>Harman’s test insufficient for common method bias.</w:t>
+              <w:t>Harman’s test insufficient for CMB.</w:t>
             </w:r>
           </w:p>
         </w:tc>
@@ -365,7 +397,7 @@
           </w:tcPr>
           <w:p>
             <w:r>
-              <w:t>fsQCA value unclear; tables not self-contained; mislabelled.</w:t>
+              <w:t>fsQCA value unclear; tables mislabelled; model logic.</w:t>
             </w:r>
           </w:p>
         </w:tc>
@@ -375,7 +407,7 @@
           </w:tcPr>
           <w:p>
             <w:r>
-              <w:t>Justified the configurational approach; standardised labels; corrected the configuration captions and the calibration description.</w:t>
+              <w:t>Justified the configurational approach; corrected captions and calibration; evaluated H1–H3 configurationally.</w:t>
             </w:r>
           </w:p>
         </w:tc>
@@ -385,7 +417,7 @@
           </w:tcPr>
           <w:p>
             <w:r>
-              <w:t>Sections 4.1, 5.3; Tables 5–6</w:t>
+              <w:t>Sections 4.1, 5.3, 5.4; Tables 5–6</w:t>
             </w:r>
           </w:p>
         </w:tc>
@@ -397,7 +429,7 @@
           </w:tcPr>
           <w:p>
             <w:r>
-              <w:t>Model logic (mediation vs configuration).</w:t>
+              <w:t>Unsupported NFT/blockchain/SDT claims; grandiose writing.</w:t>
             </w:r>
           </w:p>
         </w:tc>
@@ -407,7 +439,7 @@
           </w:tcPr>
           <w:p>
             <w:r>
-              <w:t>Clarified that fsQCA tests sufficiency/equifinality; evaluated H1–H3 configurationally; noted a complementary mediation test as future work.</w:t>
+              <w:t>Moved these to future opportunities; hedged theoretical claims; replaced the title; standardised terminology.</w:t>
             </w:r>
           </w:p>
         </w:tc>
@@ -417,7 +449,7 @@
           </w:tcPr>
           <w:p>
             <w:r>
-              <w:t>Section 5.4</w:t>
+              <w:t>Discussion; Implications; throughout</w:t>
             </w:r>
           </w:p>
         </w:tc>
@@ -429,7 +461,7 @@
           </w:tcPr>
           <w:p>
             <w:r>
-              <w:t>Unsupported NFT/blockchain/SDT claims.</w:t>
+              <w:t>Metaverse hype / industry pullback ignored.</w:t>
             </w:r>
           </w:p>
         </w:tc>
@@ -439,7 +471,7 @@
           </w:tcPr>
           <w:p>
             <w:r>
-              <w:t>Moved these to clearly labelled future opportunities; hedged theoretical claims to match the measured model; reframed Figure 5 conceptually.</w:t>
+              <w:t>Added a candid context paragraph repositioning relevance toward active virtual worlds and future immersive ecosystems.</w:t>
             </w:r>
           </w:p>
         </w:tc>
@@ -449,39 +481,7 @@
           </w:tcPr>
           <w:p>
             <w:r>
-              <w:t>Discussion; Implications</w:t>
-            </w:r>
-          </w:p>
-        </w:tc>
-      </w:tr>
-      <w:tr>
-        <w:tc>
-          <w:tcPr>
-            <w:tcW w:type="dxa" w:w="2880"/>
-          </w:tcPr>
-          <w:p>
-            <w:r>
-              <w:t>Metaverse hype / industry pullback ignored; grandiose writing.</w:t>
-            </w:r>
-          </w:p>
-        </w:tc>
-        <w:tc>
-          <w:tcPr>
-            <w:tcW w:type="dxa" w:w="2880"/>
-          </w:tcPr>
-          <w:p>
-            <w:r>
-              <w:t>Added a candid context paragraph; replaced the title; standardised terminology and fixed cross-references throughout.</w:t>
-            </w:r>
-          </w:p>
-        </w:tc>
-        <w:tc>
-          <w:tcPr>
-            <w:tcW w:type="dxa" w:w="2880"/>
-          </w:tcPr>
-          <w:p>
-            <w:r>
-              <w:t>Title; Limitations; throughout</w:t>
+              <w:t>Limitations</w:t>
             </w:r>
           </w:p>
         </w:tc>
@@ -490,7 +490,7 @@
     <w:p/>
     <w:p>
       <w:r>
-        <w:t>We confirm that this manuscript is original, is not under review elsewhere, and that all authors approve the submission. We thank the editor and reviewers for feedback that materially strengthened the paper, and we hope it is now suitable for the Journal of Consumer Psychology.</w:t>
+        <w:t>We confirm that this manuscript is original, is not under review elsewhere, and that all authors approve its submission. We thank the editor and reviewers for feedback that materially strengthened the paper, and we hope it is now suitable for Psychology &amp; Marketing.</w:t>
       </w:r>
     </w:p>
     <w:p>

</xml_diff>